<commit_message>
Término da análise do código e qualidade
</commit_message>
<xml_diff>
--- a/Documentação/Qualidade e Teste de Software/Revisão de Código e Qualidade Durante o Desenvolvimento.docx
+++ b/Documentação/Qualidade e Teste de Software/Revisão de Código e Qualidade Durante o Desenvolvimento.docx
@@ -793,8 +793,6 @@
           <w:b/>
         </w:rPr>
       </w:pPr>
-      <w:bookmarkStart w:id="0" w:name="_GoBack"/>
-      <w:bookmarkEnd w:id="0"/>
     </w:p>
     <w:p>
       <w:pPr>
@@ -824,6 +822,7 @@
       <w:r>
         <w:rPr>
           <w:b/>
+          <w:noProof/>
         </w:rPr>
         <w:drawing>
           <wp:inline distT="0" distB="0" distL="0" distR="0" wp14:anchorId="0F246B5F" wp14:editId="2D26B084">
@@ -871,12 +870,13 @@
       <w:r>
         <w:rPr>
           <w:b/>
+          <w:noProof/>
         </w:rPr>
         <w:lastRenderedPageBreak/>
         <w:drawing>
           <wp:inline distT="0" distB="0" distL="0" distR="0" wp14:anchorId="4BEB5837" wp14:editId="4E66C80C">
             <wp:extent cx="5400040" cy="3667760"/>
-            <wp:effectExtent l="0" t="0" r="0" b="8890"/>
+            <wp:effectExtent l="0" t="0" r="0" b="0"/>
             <wp:docPr id="2" name="Imagem 2"/>
             <wp:cNvGraphicFramePr>
               <a:graphicFrameLocks xmlns:a="http://schemas.openxmlformats.org/drawingml/2006/main" noChangeAspect="1"/>
@@ -926,6 +926,7 @@
       <w:r>
         <w:rPr>
           <w:b/>
+          <w:noProof/>
         </w:rPr>
         <w:drawing>
           <wp:inline distT="0" distB="0" distL="0" distR="0" wp14:anchorId="0FA522B6" wp14:editId="152E2168">
@@ -972,25 +973,18 @@
       </w:pPr>
     </w:p>
     <w:p>
-      <w:pPr>
-        <w:rPr>
-          <w:b/>
-        </w:rPr>
-      </w:pPr>
-    </w:p>
-    <w:p>
-      <w:pPr>
-        <w:rPr>
-          <w:b/>
-        </w:rPr>
-      </w:pPr>
-    </w:p>
-    <w:p>
-      <w:pPr>
-        <w:rPr>
-          <w:b/>
-        </w:rPr>
-      </w:pPr>
+      <w:r>
+        <w:rPr>
+          <w:b/>
+        </w:rPr>
+        <w:t xml:space="preserve">R: </w:t>
+      </w:r>
+      <w:r>
+        <w:t>Sim, é um código</w:t>
+      </w:r>
+      <w:r>
+        <w:t xml:space="preserve"> compreensível aos olhos de quem não desenvolveu e segue uma lógica linear. Além disso, bate totalmente com as especificações da tal regra de negócio</w:t>
+      </w:r>
     </w:p>
     <w:p>
       <w:pPr>
@@ -1074,181 +1068,67 @@
           <w:b/>
         </w:rPr>
       </w:pPr>
-    </w:p>
-    <w:p>
-      <w:pPr>
-        <w:rPr>
-          <w:b/>
-        </w:rPr>
-      </w:pPr>
-    </w:p>
-    <w:p>
-      <w:pPr>
-        <w:rPr>
-          <w:b/>
-        </w:rPr>
-      </w:pPr>
-    </w:p>
-    <w:p>
-      <w:pPr>
-        <w:rPr>
-          <w:b/>
-        </w:rPr>
-      </w:pPr>
-    </w:p>
-    <w:p>
-      <w:pPr>
-        <w:rPr>
-          <w:b/>
-        </w:rPr>
-      </w:pPr>
-    </w:p>
-    <w:p>
-      <w:pPr>
-        <w:rPr>
-          <w:b/>
-        </w:rPr>
-      </w:pPr>
-    </w:p>
-    <w:p>
-      <w:pPr>
-        <w:rPr>
-          <w:b/>
-        </w:rPr>
-      </w:pPr>
-    </w:p>
-    <w:p>
-      <w:pPr>
-        <w:rPr>
-          <w:b/>
-        </w:rPr>
-      </w:pPr>
-    </w:p>
-    <w:p>
-      <w:pPr>
-        <w:rPr>
-          <w:b/>
-        </w:rPr>
-      </w:pPr>
-    </w:p>
-    <w:p>
-      <w:pPr>
-        <w:rPr>
-          <w:b/>
-        </w:rPr>
-      </w:pPr>
-    </w:p>
-    <w:p>
-      <w:pPr>
-        <w:rPr>
-          <w:b/>
-        </w:rPr>
-      </w:pPr>
-    </w:p>
-    <w:p>
-      <w:pPr>
-        <w:rPr>
-          <w:b/>
-        </w:rPr>
-      </w:pPr>
-    </w:p>
-    <w:p>
-      <w:pPr>
-        <w:rPr>
-          <w:b/>
-        </w:rPr>
-      </w:pPr>
-    </w:p>
-    <w:p>
-      <w:pPr>
-        <w:rPr>
-          <w:b/>
-        </w:rPr>
-      </w:pPr>
-    </w:p>
-    <w:p>
-      <w:pPr>
-        <w:rPr>
-          <w:b/>
-        </w:rPr>
-      </w:pPr>
-    </w:p>
-    <w:p>
-      <w:pPr>
-        <w:rPr>
-          <w:b/>
-        </w:rPr>
-      </w:pPr>
-    </w:p>
-    <w:p>
-      <w:pPr>
-        <w:rPr>
-          <w:b/>
-        </w:rPr>
-      </w:pPr>
-    </w:p>
-    <w:p>
-      <w:pPr>
-        <w:rPr>
-          <w:b/>
-        </w:rPr>
-      </w:pPr>
-    </w:p>
-    <w:p>
-      <w:pPr>
-        <w:rPr>
-          <w:b/>
-        </w:rPr>
-      </w:pPr>
-    </w:p>
-    <w:p>
-      <w:pPr>
-        <w:rPr>
-          <w:b/>
-        </w:rPr>
-      </w:pPr>
-    </w:p>
-    <w:p>
-      <w:pPr>
-        <w:rPr>
-          <w:b/>
-        </w:rPr>
-      </w:pPr>
-    </w:p>
-    <w:p>
-      <w:pPr>
-        <w:rPr>
-          <w:b/>
-        </w:rPr>
-      </w:pPr>
-    </w:p>
-    <w:p>
-      <w:pPr>
-        <w:rPr>
-          <w:b/>
-        </w:rPr>
-      </w:pPr>
-    </w:p>
-    <w:p>
-      <w:pPr>
-        <w:rPr>
-          <w:b/>
-        </w:rPr>
-      </w:pPr>
-    </w:p>
-    <w:p>
-      <w:pPr>
-        <w:rPr>
-          <w:b/>
-        </w:rPr>
-      </w:pPr>
-    </w:p>
-    <w:p>
-      <w:pPr>
-        <w:rPr>
-          <w:b/>
-        </w:rPr>
-      </w:pPr>
+      <w:r>
+        <w:rPr>
+          <w:b/>
+        </w:rPr>
+        <w:drawing>
+          <wp:inline distT="0" distB="0" distL="0" distR="0" wp14:anchorId="0086B021" wp14:editId="504914C1">
+            <wp:extent cx="5400040" cy="3895090"/>
+            <wp:effectExtent l="0" t="0" r="0" b="0"/>
+            <wp:docPr id="6" name="Imagem 6"/>
+            <wp:cNvGraphicFramePr>
+              <a:graphicFrameLocks xmlns:a="http://schemas.openxmlformats.org/drawingml/2006/main" noChangeAspect="1"/>
+            </wp:cNvGraphicFramePr>
+            <a:graphic xmlns:a="http://schemas.openxmlformats.org/drawingml/2006/main">
+              <a:graphicData uri="http://schemas.openxmlformats.org/drawingml/2006/picture">
+                <pic:pic xmlns:pic="http://schemas.openxmlformats.org/drawingml/2006/picture">
+                  <pic:nvPicPr>
+                    <pic:cNvPr id="1" name=""/>
+                    <pic:cNvPicPr/>
+                  </pic:nvPicPr>
+                  <pic:blipFill>
+                    <a:blip r:embed="rId7"/>
+                    <a:stretch>
+                      <a:fillRect/>
+                    </a:stretch>
+                  </pic:blipFill>
+                  <pic:spPr>
+                    <a:xfrm>
+                      <a:off x="0" y="0"/>
+                      <a:ext cx="5400040" cy="3895090"/>
+                    </a:xfrm>
+                    <a:prstGeom prst="rect">
+                      <a:avLst/>
+                    </a:prstGeom>
+                  </pic:spPr>
+                </pic:pic>
+              </a:graphicData>
+            </a:graphic>
+          </wp:inline>
+        </w:drawing>
+      </w:r>
+    </w:p>
+    <w:p>
+      <w:pPr>
+        <w:rPr>
+          <w:b/>
+        </w:rPr>
+      </w:pPr>
+    </w:p>
+    <w:p>
+      <w:r>
+        <w:rPr>
+          <w:b/>
+        </w:rPr>
+        <w:t xml:space="preserve">R: </w:t>
+      </w:r>
+      <w:r>
+        <w:t>Sim, é um código</w:t>
+      </w:r>
+      <w:r>
+        <w:t xml:space="preserve"> compreensível aos olhos de quem não desenvolveu e segue uma lógica linear. Além disso, bate totalmente com as especificações da tal regra de negócio</w:t>
+      </w:r>
     </w:p>
     <w:p>
       <w:pPr>
@@ -1373,16 +1253,84 @@
         <w:rPr>
           <w:b/>
         </w:rPr>
+        <w:lastRenderedPageBreak/>
         <w:t>REVIS</w:t>
       </w:r>
       <w:r>
         <w:rPr>
           <w:b/>
         </w:rPr>
-        <w:t>ÃO DO CÓDIGO CORRESPONDENTE A F11 (APROVAR OU RECUSAR SOLICITAÇÃO)</w:t>
+        <w:t>ÃO DO CÓDI</w:t>
+      </w:r>
+      <w:bookmarkStart w:id="0" w:name="_GoBack"/>
+      <w:bookmarkEnd w:id="0"/>
+      <w:r>
+        <w:rPr>
+          <w:b/>
+        </w:rPr>
+        <w:t>GO CORRESPONDENTE A F11 (APROVAR OU RECUSAR SOLICITAÇÃO)</w:t>
+      </w:r>
+    </w:p>
+    <w:p>
+      <w:pPr>
+        <w:jc w:val="center"/>
+      </w:pPr>
+      <w:r>
+        <w:drawing>
+          <wp:inline distT="0" distB="0" distL="0" distR="0" wp14:anchorId="7E06DF69" wp14:editId="242573A5">
+            <wp:extent cx="5819775" cy="3520334"/>
+            <wp:effectExtent l="0" t="0" r="0" b="4445"/>
+            <wp:docPr id="4" name="Imagem 4"/>
+            <wp:cNvGraphicFramePr>
+              <a:graphicFrameLocks xmlns:a="http://schemas.openxmlformats.org/drawingml/2006/main" noChangeAspect="1"/>
+            </wp:cNvGraphicFramePr>
+            <a:graphic xmlns:a="http://schemas.openxmlformats.org/drawingml/2006/main">
+              <a:graphicData uri="http://schemas.openxmlformats.org/drawingml/2006/picture">
+                <pic:pic xmlns:pic="http://schemas.openxmlformats.org/drawingml/2006/picture">
+                  <pic:nvPicPr>
+                    <pic:cNvPr id="1" name=""/>
+                    <pic:cNvPicPr/>
+                  </pic:nvPicPr>
+                  <pic:blipFill>
+                    <a:blip r:embed="rId8"/>
+                    <a:stretch>
+                      <a:fillRect/>
+                    </a:stretch>
+                  </pic:blipFill>
+                  <pic:spPr>
+                    <a:xfrm>
+                      <a:off x="0" y="0"/>
+                      <a:ext cx="5828029" cy="3525327"/>
+                    </a:xfrm>
+                    <a:prstGeom prst="rect">
+                      <a:avLst/>
+                    </a:prstGeom>
+                  </pic:spPr>
+                </pic:pic>
+              </a:graphicData>
+            </a:graphic>
+          </wp:inline>
+        </w:drawing>
       </w:r>
     </w:p>
     <w:p/>
+    <w:p>
+      <w:r>
+        <w:rPr>
+          <w:b/>
+        </w:rPr>
+        <w:t xml:space="preserve">R: </w:t>
+      </w:r>
+      <w:r>
+        <w:t>Sim, é um código</w:t>
+      </w:r>
+      <w:r>
+        <w:t xml:space="preserve"> compreensível aos olhos de quem não desenvolveu e segue uma lógica linear. Além disso, bate totalmente com as especificações da tal regra de negócio</w:t>
+      </w:r>
+      <w:r>
+        <w:t xml:space="preserve"> </w:t>
+      </w:r>
+    </w:p>
     <w:sectPr>
       <w:pgSz w:w="11906" w:h="16838"/>
       <w:pgMar w:top="1417" w:right="1701" w:bottom="1417" w:left="1701" w:header="708" w:footer="708" w:gutter="0"/>

</xml_diff>